<commit_message>
Adicionar modificações na apresentação e relatório
</commit_message>
<xml_diff>
--- a/docs/relatorio.docx
+++ b/docs/relatorio.docx
@@ -2350,7 +2350,47 @@
         <w:t xml:space="preserve"> </w:t>
       </w:r>
       <w:r>
-        <w:t xml:space="preserve">(sem vazamento).</w:t>
+        <w:t xml:space="preserve">(sem vazamento). Como</w:t>
+      </w:r>
+      <w:r>
+        <w:t xml:space="preserve"> </w:t>
+      </w:r>
+      <w:r>
+        <w:rPr>
+          <w:rStyle w:val="VerbatimChar"/>
+        </w:rPr>
+        <w:t xml:space="preserve">Chol_por_Idade</w:t>
+      </w:r>
+      <w:r>
+        <w:t xml:space="preserve"> </w:t>
+      </w:r>
+      <w:r>
+        <w:t xml:space="preserve">depende de</w:t>
+      </w:r>
+      <w:r>
+        <w:t xml:space="preserve"> </w:t>
+      </w:r>
+      <w:r>
+        <w:rPr>
+          <w:rStyle w:val="VerbatimChar"/>
+        </w:rPr>
+        <w:t xml:space="preserve">Cholesterol</w:t>
+      </w:r>
+      <w:r>
+        <w:t xml:space="preserve">, esses registros também são imputados no atributo derivado. A base</w:t>
+      </w:r>
+      <w:r>
+        <w:t xml:space="preserve"> </w:t>
+      </w:r>
+      <w:r>
+        <w:rPr>
+          <w:b/>
+          <w:bCs/>
+        </w:rPr>
+        <w:t xml:space="preserve">não contém triglicerídeos</w:t>
+      </w:r>
+      <w:r>
+        <w:t xml:space="preserve">, variável usada em alguns estudos clínicos (ex.: Page et al., 1970).</w:t>
       </w:r>
     </w:p>
     <w:p>
@@ -9802,18 +9842,18 @@
               <w:pStyle w:val="Compact"/>
             </w:pPr>
             <w:r>
-              <w:t xml:space="preserve">Abass &amp; Bathla (2025), Springer</w:t>
-            </w:r>
-          </w:p>
-        </w:tc>
-        <w:tc>
-          <w:tcPr/>
-          <w:p>
-            <w:pPr>
-              <w:pStyle w:val="Compact"/>
-            </w:pPr>
-            <w:r>
-              <w:t xml:space="preserve">Aprendizado de máquina + engenharia de atributos</w:t>
+              <w:t xml:space="preserve">Abass et al. (2025), Springer</w:t>
+            </w:r>
+          </w:p>
+        </w:tc>
+        <w:tc>
+          <w:tcPr/>
+          <w:p>
+            <w:pPr>
+              <w:pStyle w:val="Compact"/>
+            </w:pPr>
+            <w:r>
+              <w:t xml:space="preserve">Compara LR, SVM, KNN, DT e RF com engenharia de atributos</w:t>
             </w:r>
           </w:p>
         </w:tc>
@@ -9918,18 +9958,18 @@
               <w:pStyle w:val="Compact"/>
             </w:pPr>
             <w:r>
-              <w:t xml:space="preserve">Idade, colesterol e triglicerídeos na predição de DAC</w:t>
-            </w:r>
-          </w:p>
-        </w:tc>
-        <w:tc>
-          <w:tcPr/>
-          <w:p>
-            <w:pPr>
-              <w:pStyle w:val="Compact"/>
-            </w:pPr>
-            <w:r>
-              <w:t xml:space="preserve">Base para</w:t>
+              <w:t xml:space="preserve">Idade e colesterol total como preditores de DAC</w:t>
+            </w:r>
+          </w:p>
+        </w:tc>
+        <w:tc>
+          <w:tcPr/>
+          <w:p>
+            <w:pPr>
+              <w:pStyle w:val="Compact"/>
+            </w:pPr>
+            <w:r>
+              <w:t xml:space="preserve">Fundamenta idade e colesterol; a razão</w:t>
             </w:r>
             <w:r>
               <w:t xml:space="preserve"> </w:t>
@@ -9939,6 +9979,12 @@
                 <w:rStyle w:val="VerbatimChar"/>
               </w:rPr>
               <w:t xml:space="preserve">Chol_por_Idade</w:t>
+            </w:r>
+            <w:r>
+              <w:t xml:space="preserve"> </w:t>
+            </w:r>
+            <w:r>
+              <w:t xml:space="preserve">é proposta deste trabalho</w:t>
             </w:r>
           </w:p>
         </w:tc>
@@ -10167,7 +10213,157 @@
         <w:t xml:space="preserve"> </w:t>
       </w:r>
       <w:r>
-        <w:t xml:space="preserve">e precisam de validação externa.</w:t>
+        <w:t xml:space="preserve">e precisam de validação externa. Em particular, Page et al. (1970) fundamentam</w:t>
+      </w:r>
+      <w:r>
+        <w:t xml:space="preserve"> </w:t>
+      </w:r>
+      <w:r>
+        <w:rPr>
+          <w:b/>
+          <w:bCs/>
+        </w:rPr>
+        <w:t xml:space="preserve">idade e colesterol total</w:t>
+      </w:r>
+      <w:r>
+        <w:t xml:space="preserve"> </w:t>
+      </w:r>
+      <w:r>
+        <w:t xml:space="preserve">como preditores de DAC, mas</w:t>
+      </w:r>
+      <w:r>
+        <w:t xml:space="preserve"> </w:t>
+      </w:r>
+      <w:r>
+        <w:rPr>
+          <w:b/>
+          <w:bCs/>
+        </w:rPr>
+        <w:t xml:space="preserve">não propõem</w:t>
+      </w:r>
+      <w:r>
+        <w:t xml:space="preserve"> </w:t>
+      </w:r>
+      <w:r>
+        <w:t xml:space="preserve">a razão</w:t>
+      </w:r>
+      <w:r>
+        <w:t xml:space="preserve"> </w:t>
+      </w:r>
+      <w:r>
+        <w:rPr>
+          <w:rStyle w:val="VerbatimChar"/>
+        </w:rPr>
+        <w:t xml:space="preserve">Chol_por_Idade</w:t>
+      </w:r>
+      <w:r>
+        <w:t xml:space="preserve">; essa razão é uma</w:t>
+      </w:r>
+      <w:r>
+        <w:t xml:space="preserve"> </w:t>
+      </w:r>
+      <w:r>
+        <w:rPr>
+          <w:b/>
+          <w:bCs/>
+        </w:rPr>
+        <w:t xml:space="preserve">proposta deste trabalho</w:t>
+      </w:r>
+      <w:r>
+        <w:t xml:space="preserve">. Além disso, a base do Kaggle</w:t>
+      </w:r>
+      <w:r>
+        <w:t xml:space="preserve"> </w:t>
+      </w:r>
+      <w:r>
+        <w:rPr>
+          <w:b/>
+          <w:bCs/>
+        </w:rPr>
+        <w:t xml:space="preserve">não contém triglicerídeos</w:t>
+      </w:r>
+      <w:r>
+        <w:t xml:space="preserve"> </w:t>
+      </w:r>
+      <w:r>
+        <w:t xml:space="preserve">e apresenta</w:t>
+      </w:r>
+      <w:r>
+        <w:t xml:space="preserve"> </w:t>
+      </w:r>
+      <w:r>
+        <w:rPr>
+          <w:b/>
+          <w:bCs/>
+        </w:rPr>
+        <w:t xml:space="preserve">172 registros com</w:t>
+      </w:r>
+      <w:r>
+        <w:rPr>
+          <w:b/>
+          <w:bCs/>
+        </w:rPr>
+        <w:t xml:space="preserve"> </w:t>
+      </w:r>
+      <w:r>
+        <w:rPr>
+          <w:rStyle w:val="VerbatimChar"/>
+          <w:b/>
+          <w:bCs/>
+        </w:rPr>
+        <w:t xml:space="preserve">Cholesterol = 0</w:t>
+      </w:r>
+      <w:r>
+        <w:t xml:space="preserve">, tratados como valores ausentes (</w:t>
+      </w:r>
+      <w:r>
+        <w:rPr>
+          <w:rStyle w:val="VerbatimChar"/>
+        </w:rPr>
+        <w:t xml:space="preserve">NaN</w:t>
+      </w:r>
+      <w:r>
+        <w:t xml:space="preserve">) e imputados</w:t>
+      </w:r>
+      <w:r>
+        <w:t xml:space="preserve"> </w:t>
+      </w:r>
+      <w:r>
+        <w:rPr>
+          <w:b/>
+          <w:bCs/>
+        </w:rPr>
+        <w:t xml:space="preserve">dentro do pipeline</w:t>
+      </w:r>
+      <w:r>
+        <w:t xml:space="preserve">. Como</w:t>
+      </w:r>
+      <w:r>
+        <w:t xml:space="preserve"> </w:t>
+      </w:r>
+      <w:r>
+        <w:rPr>
+          <w:rStyle w:val="VerbatimChar"/>
+        </w:rPr>
+        <w:t xml:space="preserve">Chol_por_Idade</w:t>
+      </w:r>
+      <w:r>
+        <w:t xml:space="preserve"> </w:t>
+      </w:r>
+      <w:r>
+        <w:t xml:space="preserve">depende de</w:t>
+      </w:r>
+      <w:r>
+        <w:t xml:space="preserve"> </w:t>
+      </w:r>
+      <w:r>
+        <w:rPr>
+          <w:rStyle w:val="VerbatimChar"/>
+        </w:rPr>
+        <w:t xml:space="preserve">Cholesterol</w:t>
+      </w:r>
+      <w:r>
+        <w:t xml:space="preserve">, esses registros também recebem imputação no atributo derivado.</w:t>
       </w:r>
     </w:p>
     <w:p>
@@ -10631,20 +10827,7 @@
         </w:numPr>
       </w:pPr>
       <w:r>
-        <w:t xml:space="preserve">ABASS, A.; BATHLA, G. Heart Disease Prediction Using Machine Learning with Feature Engineering.</w:t>
-      </w:r>
-      <w:r>
-        <w:t xml:space="preserve"> </w:t>
-      </w:r>
-      <w:r>
-        <w:rPr>
-          <w:b/>
-          <w:bCs/>
-        </w:rPr>
-        <w:t xml:space="preserve">Springer</w:t>
-      </w:r>
-      <w:r>
-        <w:t xml:space="preserve">, 2025.</w:t>
+        <w:t xml:space="preserve">ABASS, A.; BATHLA, G.; WASSON, V. Heart Disease Prediction Using Machine Learning with Feature Engineering. In: Soft Computing and Signal Processing (ICSCSP 2024). Lecture Notes in Networks and Systems, v. 1221. Springer, 2025, p. 697–709. DOI: https://doi.org/10.1007/978-981-96-0924-6_55.</w:t>
       </w:r>
     </w:p>
     <w:p>
@@ -10719,7 +10902,7 @@
         <w:t xml:space="preserve">Circulation</w:t>
       </w:r>
       <w:r>
-        <w:t xml:space="preserve">, 1970.</w:t>
+        <w:t xml:space="preserve">, v. 42, n. 4, p. 625–645, 1970. DOI: https://doi.org/10.1161/01.cir.42.4.625.</w:t>
       </w:r>
     </w:p>
     <w:p>

</xml_diff>